<commit_message>
modelo carta Doc - reparada
</commit_message>
<xml_diff>
--- a/natta-app/docs/cartas-documento/modelo-CD/MODELO CARTA DOC.docx
+++ b/natta-app/docs/cartas-documento/modelo-CD/MODELO CARTA DOC.docx
@@ -2775,18 +2775,121 @@
                               </w:rPr>
                               <w:t xml:space="preserve"> </w:t>
                             </w:r>
+                            <w:r>
+                              <w:rPr>
+                                <w:b/>
+                                <w:i/>
+                                <w:sz w:val="24"/>
+                                <w:szCs w:val="24"/>
+                                <w:lang w:val="es-AR"/>
+                              </w:rPr>
+                              <w:t xml:space="preserve">IANATELLI, Máximo </w:t>
+                            </w:r>
+                            <w:r>
+                              <w:rPr>
+                                <w:i/>
+                                <w:sz w:val="24"/>
+                                <w:szCs w:val="24"/>
+                                <w:lang w:val="es-AR"/>
+                              </w:rPr>
+                              <w:t xml:space="preserve">durante el presente ciclo lectivo, deuda que alcanza a la fecha un total de capital en pesos de </w:t>
+                            </w:r>
+                            <w:r>
+                              <w:rPr>
+                                <w:b/>
+                                <w:i/>
+                                <w:sz w:val="24"/>
+                              </w:rPr>
+                              <w:t xml:space="preserve">cuatrocientos ochenta y seis mil trescientos ocho con 59/100 </w:t>
+                            </w:r>
+                            <w:r>
+                              <w:rPr>
+                                <w:b/>
+                                <w:i/>
+                                <w:sz w:val="24"/>
+                              </w:rPr>
+                              <w:t xml:space="preserve">cent. </w:t>
+                            </w:r>
+                            <w:r>
+                              <w:rPr>
+                                <w:b/>
+                                <w:i/>
+                                <w:sz w:val="24"/>
+                              </w:rPr>
+                              <w:t>($ 486.308,59.-),</w:t>
+                            </w:r>
+                            <w:r>
+                              <w:rPr>
+                                <w:i/>
+                                <w:sz w:val="24"/>
+                              </w:rPr>
+                              <w:t xml:space="preserve"> </w:t>
+                            </w:r>
+                            <w:r>
+                              <w:rPr>
+                                <w:i/>
+                                <w:sz w:val="24"/>
+                                <w:szCs w:val="24"/>
+                                <w:lang w:val="es-AR"/>
+                              </w:rPr>
+                              <w:t xml:space="preserve">habiendo dado a Ud. diversas oportunidades a los fines de regularizar la situación derivada de su incumplimiento, notificamos a Ud. que no </w:t>
+                            </w:r>
+                            <w:r>
+                              <w:rPr>
+                                <w:i/>
+                                <w:sz w:val="24"/>
+                                <w:szCs w:val="24"/>
+                                <w:lang w:val="es-AR"/>
+                              </w:rPr>
+                              <w:t>re matricularemos</w:t>
+                            </w:r>
+                            <w:r>
+                              <w:rPr>
+                                <w:i/>
+                                <w:sz w:val="24"/>
+                                <w:szCs w:val="24"/>
+                                <w:lang w:val="es-AR"/>
+                              </w:rPr>
+                              <w:t xml:space="preserve"> a su</w:t>
+                            </w:r>
+                            <w:r>
+                              <w:rPr>
+                                <w:i/>
+                                <w:sz w:val="24"/>
+                                <w:szCs w:val="24"/>
+                                <w:lang w:val="es-AR"/>
+                              </w:rPr>
+                              <w:t xml:space="preserve"> hijo</w:t>
+                            </w:r>
+                            <w:r>
+                              <w:rPr>
+                                <w:i/>
+                                <w:sz w:val="24"/>
+                                <w:szCs w:val="24"/>
+                                <w:lang w:val="es-AR"/>
+                              </w:rPr>
+                              <w:t xml:space="preserve"> para el próximo ciclo escolar</w:t>
+                            </w:r>
+                            <w:r>
+                              <w:rPr>
+                                <w:i/>
+                                <w:sz w:val="24"/>
+                                <w:szCs w:val="24"/>
+                                <w:lang w:val="es-AR"/>
+                              </w:rPr>
+                              <w:t xml:space="preserve"> </w:t>
+                            </w:r>
                             <w:bookmarkStart w:id="0" w:name="_GoBack"/>
-                            <w:r>
-                              <w:rPr>
-                                <w:b/>
+                            <w:bookmarkEnd w:id="0"/>
+                            <w:r>
+                              <w:rPr>
                                 <w:i/>
                                 <w:sz w:val="24"/>
                                 <w:szCs w:val="24"/>
                                 <w:lang w:val="es-AR"/>
                               </w:rPr>
-                              <w:t xml:space="preserve">IANATELLI, Máximo </w:t>
-                            </w:r>
-                            <w:bookmarkEnd w:id="0"/>
+                              <w:t>2027</w:t>
+                            </w:r>
                             <w:r>
                               <w:rPr>
                                 <w:i/>
@@ -2794,67 +2897,7 @@
                                 <w:szCs w:val="24"/>
                                 <w:lang w:val="es-AR"/>
                               </w:rPr>
-                              <w:t xml:space="preserve">durante el presente ciclo lectivo, deuda que alcanza a la fecha un total de capital en pesos de </w:t>
-                            </w:r>
-                            <w:r>
-                              <w:rPr>
-                                <w:b/>
-                              </w:rPr>
-                              <w:t>cuatrocientos ochenta y seis mil trescientos ocho con 59/100 ($ 486.308,59.-)</w:t>
-                            </w:r>
-                            <w:r>
-                              <w:rPr>
-                                <w:b/>
-                              </w:rPr>
-                              <w:t>,</w:t>
-                            </w:r>
-                            <w:r>
-                              <w:t xml:space="preserve"> </w:t>
-                            </w:r>
-                            <w:r>
-                              <w:rPr>
-                                <w:i/>
-                                <w:sz w:val="24"/>
-                                <w:szCs w:val="24"/>
-                                <w:lang w:val="es-AR"/>
-                              </w:rPr>
-                              <w:t xml:space="preserve">habiendo dado a Ud. diversas oportunidades a los fines de regularizar la situación derivada de su incumplimiento, notificamos a Ud. que no </w:t>
-                            </w:r>
-                            <w:r>
-                              <w:rPr>
-                                <w:i/>
-                                <w:sz w:val="24"/>
-                                <w:szCs w:val="24"/>
-                                <w:lang w:val="es-AR"/>
-                              </w:rPr>
-                              <w:t>re matricularemos</w:t>
-                            </w:r>
-                            <w:r>
-                              <w:rPr>
-                                <w:i/>
-                                <w:sz w:val="24"/>
-                                <w:szCs w:val="24"/>
-                                <w:lang w:val="es-AR"/>
-                              </w:rPr>
-                              <w:t xml:space="preserve"> a su</w:t>
-                            </w:r>
-                            <w:r>
-                              <w:rPr>
-                                <w:i/>
-                                <w:sz w:val="24"/>
-                                <w:szCs w:val="24"/>
-                                <w:lang w:val="es-AR"/>
-                              </w:rPr>
-                              <w:t xml:space="preserve"> hijo</w:t>
-                            </w:r>
-                            <w:r>
-                              <w:rPr>
-                                <w:i/>
-                                <w:sz w:val="24"/>
-                                <w:szCs w:val="24"/>
-                                <w:lang w:val="es-AR"/>
-                              </w:rPr>
-                              <w:t xml:space="preserve"> para el próximo ciclo escolar. </w:t>
+                              <w:t xml:space="preserve">. </w:t>
                             </w:r>
                           </w:p>
                           <w:p>
@@ -3148,7 +3191,16 @@
                                 <w:szCs w:val="24"/>
                                 <w:lang w:val="es-ES_tradnl"/>
                               </w:rPr>
-                              <w:t>Registro N° 45/24</w:t>
+                              <w:t xml:space="preserve">Registro N° </w:t>
+                            </w:r>
+                            <w:r>
+                              <w:rPr>
+                                <w:i/>
+                                <w:sz w:val="20"/>
+                                <w:szCs w:val="24"/>
+                                <w:lang w:val="es-ES_tradnl"/>
+                              </w:rPr>
+                              <w:t>38</w:t>
                             </w:r>
                           </w:p>
                           <w:p>
@@ -3181,6 +3233,10 @@
           </mc:Choice>
           <mc:Fallback>
             <w:pict>
+              <v:shapetype id="_x0000_t202" coordsize="21600,21600" o:spt="202" path="m,l,21600r21600,l21600,xe">
+                <v:stroke joinstyle="miter"/>
+                <v:path gradientshapeok="t" o:connecttype="rect"/>
+              </v:shapetype>
               <v:shape id="Text Box 23" o:spid="_x0000_s1046" type="#_x0000_t202" style="position:absolute;left:0;text-align:left;margin-left:-2.65pt;margin-top:23.4pt;width:480pt;height:450pt;z-index:251679744;visibility:visible;mso-wrap-style:square;mso-width-percent:0;mso-height-percent:0;mso-wrap-distance-left:9pt;mso-wrap-distance-top:0;mso-wrap-distance-right:9pt;mso-wrap-distance-bottom:0;mso-position-horizontal:absolute;mso-position-horizontal-relative:text;mso-position-vertical:absolute;mso-position-vertical-relative:text;mso-width-percent:0;mso-height-percent:0;mso-width-relative:page;mso-height-relative:page;v-text-anchor:top" o:gfxdata="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" stroked="f">
                 <v:textbox>
                   <w:txbxContent>
@@ -3248,18 +3304,121 @@
                         </w:rPr>
                         <w:t xml:space="preserve"> </w:t>
                       </w:r>
+                      <w:r>
+                        <w:rPr>
+                          <w:b/>
+                          <w:i/>
+                          <w:sz w:val="24"/>
+                          <w:szCs w:val="24"/>
+                          <w:lang w:val="es-AR"/>
+                        </w:rPr>
+                        <w:t xml:space="preserve">IANATELLI, Máximo </w:t>
+                      </w:r>
+                      <w:r>
+                        <w:rPr>
+                          <w:i/>
+                          <w:sz w:val="24"/>
+                          <w:szCs w:val="24"/>
+                          <w:lang w:val="es-AR"/>
+                        </w:rPr>
+                        <w:t xml:space="preserve">durante el presente ciclo lectivo, deuda que alcanza a la fecha un total de capital en pesos de </w:t>
+                      </w:r>
+                      <w:r>
+                        <w:rPr>
+                          <w:b/>
+                          <w:i/>
+                          <w:sz w:val="24"/>
+                        </w:rPr>
+                        <w:t xml:space="preserve">cuatrocientos ochenta y seis mil trescientos ocho con 59/100 </w:t>
+                      </w:r>
+                      <w:r>
+                        <w:rPr>
+                          <w:b/>
+                          <w:i/>
+                          <w:sz w:val="24"/>
+                        </w:rPr>
+                        <w:t xml:space="preserve">cent. </w:t>
+                      </w:r>
+                      <w:r>
+                        <w:rPr>
+                          <w:b/>
+                          <w:i/>
+                          <w:sz w:val="24"/>
+                        </w:rPr>
+                        <w:t>($ 486.308,59.-),</w:t>
+                      </w:r>
+                      <w:r>
+                        <w:rPr>
+                          <w:i/>
+                          <w:sz w:val="24"/>
+                        </w:rPr>
+                        <w:t xml:space="preserve"> </w:t>
+                      </w:r>
+                      <w:r>
+                        <w:rPr>
+                          <w:i/>
+                          <w:sz w:val="24"/>
+                          <w:szCs w:val="24"/>
+                          <w:lang w:val="es-AR"/>
+                        </w:rPr>
+                        <w:t xml:space="preserve">habiendo dado a Ud. diversas oportunidades a los fines de regularizar la situación derivada de su incumplimiento, notificamos a Ud. que no </w:t>
+                      </w:r>
+                      <w:r>
+                        <w:rPr>
+                          <w:i/>
+                          <w:sz w:val="24"/>
+                          <w:szCs w:val="24"/>
+                          <w:lang w:val="es-AR"/>
+                        </w:rPr>
+                        <w:t>re matricularemos</w:t>
+                      </w:r>
+                      <w:r>
+                        <w:rPr>
+                          <w:i/>
+                          <w:sz w:val="24"/>
+                          <w:szCs w:val="24"/>
+                          <w:lang w:val="es-AR"/>
+                        </w:rPr>
+                        <w:t xml:space="preserve"> a su</w:t>
+                      </w:r>
+                      <w:r>
+                        <w:rPr>
+                          <w:i/>
+                          <w:sz w:val="24"/>
+                          <w:szCs w:val="24"/>
+                          <w:lang w:val="es-AR"/>
+                        </w:rPr>
+                        <w:t xml:space="preserve"> hijo</w:t>
+                      </w:r>
+                      <w:r>
+                        <w:rPr>
+                          <w:i/>
+                          <w:sz w:val="24"/>
+                          <w:szCs w:val="24"/>
+                          <w:lang w:val="es-AR"/>
+                        </w:rPr>
+                        <w:t xml:space="preserve"> para el próximo ciclo escolar</w:t>
+                      </w:r>
+                      <w:r>
+                        <w:rPr>
+                          <w:i/>
+                          <w:sz w:val="24"/>
+                          <w:szCs w:val="24"/>
+                          <w:lang w:val="es-AR"/>
+                        </w:rPr>
+                        <w:t xml:space="preserve"> </w:t>
+                      </w:r>
                       <w:bookmarkStart w:id="1" w:name="_GoBack"/>
-                      <w:r>
-                        <w:rPr>
-                          <w:b/>
+                      <w:bookmarkEnd w:id="1"/>
+                      <w:r>
+                        <w:rPr>
                           <w:i/>
                           <w:sz w:val="24"/>
                           <w:szCs w:val="24"/>
                           <w:lang w:val="es-AR"/>
                         </w:rPr>
-                        <w:t xml:space="preserve">IANATELLI, Máximo </w:t>
-                      </w:r>
-                      <w:bookmarkEnd w:id="1"/>
+                        <w:t>2027</w:t>
+                      </w:r>
                       <w:r>
                         <w:rPr>
                           <w:i/>
@@ -3267,67 +3426,7 @@
                           <w:szCs w:val="24"/>
                           <w:lang w:val="es-AR"/>
                         </w:rPr>
-                        <w:t xml:space="preserve">durante el presente ciclo lectivo, deuda que alcanza a la fecha un total de capital en pesos de </w:t>
-                      </w:r>
-                      <w:r>
-                        <w:rPr>
-                          <w:b/>
-                        </w:rPr>
-                        <w:t>cuatrocientos ochenta y seis mil trescientos ocho con 59/100 ($ 486.308,59.-)</w:t>
-                      </w:r>
-                      <w:r>
-                        <w:rPr>
-                          <w:b/>
-                        </w:rPr>
-                        <w:t>,</w:t>
-                      </w:r>
-                      <w:r>
-                        <w:t xml:space="preserve"> </w:t>
-                      </w:r>
-                      <w:r>
-                        <w:rPr>
-                          <w:i/>
-                          <w:sz w:val="24"/>
-                          <w:szCs w:val="24"/>
-                          <w:lang w:val="es-AR"/>
-                        </w:rPr>
-                        <w:t xml:space="preserve">habiendo dado a Ud. diversas oportunidades a los fines de regularizar la situación derivada de su incumplimiento, notificamos a Ud. que no </w:t>
-                      </w:r>
-                      <w:r>
-                        <w:rPr>
-                          <w:i/>
-                          <w:sz w:val="24"/>
-                          <w:szCs w:val="24"/>
-                          <w:lang w:val="es-AR"/>
-                        </w:rPr>
-                        <w:t>re matricularemos</w:t>
-                      </w:r>
-                      <w:r>
-                        <w:rPr>
-                          <w:i/>
-                          <w:sz w:val="24"/>
-                          <w:szCs w:val="24"/>
-                          <w:lang w:val="es-AR"/>
-                        </w:rPr>
-                        <w:t xml:space="preserve"> a su</w:t>
-                      </w:r>
-                      <w:r>
-                        <w:rPr>
-                          <w:i/>
-                          <w:sz w:val="24"/>
-                          <w:szCs w:val="24"/>
-                          <w:lang w:val="es-AR"/>
-                        </w:rPr>
-                        <w:t xml:space="preserve"> hijo</w:t>
-                      </w:r>
-                      <w:r>
-                        <w:rPr>
-                          <w:i/>
-                          <w:sz w:val="24"/>
-                          <w:szCs w:val="24"/>
-                          <w:lang w:val="es-AR"/>
-                        </w:rPr>
-                        <w:t xml:space="preserve"> para el próximo ciclo escolar. </w:t>
+                        <w:t xml:space="preserve">. </w:t>
                       </w:r>
                     </w:p>
                     <w:p>
@@ -3621,7 +3720,16 @@
                           <w:szCs w:val="24"/>
                           <w:lang w:val="es-ES_tradnl"/>
                         </w:rPr>
-                        <w:t>Registro N° 45/24</w:t>
+                        <w:t xml:space="preserve">Registro N° </w:t>
+                      </w:r>
+                      <w:r>
+                        <w:rPr>
+                          <w:i/>
+                          <w:sz w:val="20"/>
+                          <w:szCs w:val="24"/>
+                          <w:lang w:val="es-ES_tradnl"/>
+                        </w:rPr>
+                        <w:t>38</w:t>
                       </w:r>
                     </w:p>
                     <w:p>

</xml_diff>